<commit_message>
Minooooooooooooor changes to scrum summary
</commit_message>
<xml_diff>
--- a/CA2_Sprint2/word_documents/Sprint 2 Scrum Summary.docx
+++ b/CA2_Sprint2/word_documents/Sprint 2 Scrum Summary.docx
@@ -4,316 +4,835 @@
   <w:body>
     <w:p>
       <w:pPr>
-        <w:pStyle w:val="Heading3"/>
-        <w:keepNext w:val="0"/>
-        <w:keepLines w:val="0"/>
-        <w:spacing w:before="280"/>
-        <w:rPr>
-          <w:b/>
-          <w:bCs/>
-          <w:color w:val="000000"/>
-        </w:rPr>
-      </w:pPr>
-      <w:bookmarkStart w:id="0" w:name="_30gzblesydol" w:colFirst="0" w:colLast="0"/>
-      <w:bookmarkEnd w:id="0"/>
-      <w:r>
-        <w:rPr>
-          <w:b/>
-          <w:bCs/>
-          <w:color w:val="000000"/>
-        </w:rPr>
-        <w:t>Appendix C: Weekly Scrum Summary</w:t>
-      </w:r>
-    </w:p>
-    <w:p>
-      <w:pPr>
-        <w:spacing w:before="240" w:after="240" w:line="240" w:lineRule="auto"/>
-        <w:rPr>
-          <w:b/>
-          <w:bCs/>
+        <w:spacing w:line="360" w:lineRule="auto"/>
+        <w:rPr>
+          <w:b/>
+          <w:bCs/>
+          <w:sz w:val="40"/>
+          <w:szCs w:val="40"/>
+        </w:rPr>
+      </w:pPr>
+      <w:r>
+        <w:rPr>
+          <w:b/>
+          <w:bCs/>
+          <w:sz w:val="40"/>
+          <w:szCs w:val="40"/>
+        </w:rPr>
+        <w:t>SCRUM SUMMARY</w:t>
+      </w:r>
+    </w:p>
+    <w:p>
+      <w:pPr>
+        <w:rPr>
           <w:sz w:val="24"/>
           <w:szCs w:val="24"/>
-        </w:rPr>
-      </w:pPr>
-      <w:r>
-        <w:rPr>
-          <w:b/>
-          <w:bCs/>
+          <w:u w:val="single"/>
+        </w:rPr>
+      </w:pPr>
+      <w:r>
+        <w:rPr>
           <w:sz w:val="24"/>
           <w:szCs w:val="24"/>
         </w:rPr>
-        <w:t>Weekly Scrum Meeting 1 (Sprint 1 Review &amp; Sprint 2 Planning)</w:t>
-      </w:r>
-    </w:p>
-    <w:p>
-      <w:pPr>
-        <w:spacing w:before="240" w:after="240" w:line="240" w:lineRule="auto"/>
-      </w:pPr>
-      <w:r>
-        <w:rPr>
-          <w:b/>
-          <w:bCs/>
-        </w:rPr>
-        <w:t>Date:</w:t>
-      </w:r>
-      <w:r>
-        <w:t xml:space="preserve"> 21 Jan 2026 </w:t>
-      </w:r>
-    </w:p>
-    <w:p>
-      <w:pPr>
-        <w:spacing w:before="240" w:after="240" w:line="240" w:lineRule="auto"/>
-      </w:pPr>
-      <w:r>
-        <w:rPr>
-          <w:b/>
-          <w:bCs/>
-        </w:rPr>
-        <w:t>Duration:</w:t>
-      </w:r>
-      <w:r>
-        <w:t xml:space="preserve"> ~10 mins</w:t>
-      </w:r>
-    </w:p>
-    <w:p>
-      <w:pPr>
-        <w:spacing w:before="240" w:after="240"/>
-      </w:pPr>
-      <w:r>
-        <w:rPr>
-          <w:b/>
-          <w:bCs/>
-        </w:rPr>
-        <w:t>1. What tasks were completed by each person?</w:t>
-      </w:r>
-      <w:r>
-        <w:t xml:space="preserve">  </w:t>
-      </w:r>
-    </w:p>
-    <w:p>
-      <w:pPr>
-        <w:spacing w:before="240" w:after="240"/>
-      </w:pPr>
-      <w:r>
-        <w:t xml:space="preserve">Thomas focused on fixing the ETL pipeline. He realized the original script couldn't handle new incoming data rows without crashing, so he refactored the logic to check for existing booking IDs before appending. This took him about 4 hours. </w:t>
-      </w:r>
-    </w:p>
-    <w:p>
-      <w:pPr>
-        <w:spacing w:before="240" w:after="240"/>
-      </w:pPr>
-      <w:r>
-        <w:t>Lin Kai handled the project initialization. He set up the GitHub repository</w:t>
-      </w:r>
-      <w:r>
-        <w:t xml:space="preserve"> and tested local </w:t>
-      </w:r>
-      <w:proofErr w:type="spellStart"/>
-      <w:r>
-        <w:t>MLflow</w:t>
-      </w:r>
-      <w:proofErr w:type="spellEnd"/>
-      <w:r>
-        <w:t xml:space="preserve"> functionality on his own laptop first. Then he </w:t>
-      </w:r>
-      <w:r>
-        <w:t>configu</w:t>
-      </w:r>
-      <w:r>
-        <w:t>res</w:t>
-      </w:r>
-      <w:r>
-        <w:t xml:space="preserve"> </w:t>
-      </w:r>
-      <w:r>
-        <w:t xml:space="preserve">the local </w:t>
-      </w:r>
-      <w:proofErr w:type="spellStart"/>
-      <w:r>
-        <w:t>MLflow</w:t>
-      </w:r>
-      <w:proofErr w:type="spellEnd"/>
-      <w:r>
-        <w:t xml:space="preserve"> folder</w:t>
-      </w:r>
-      <w:r>
-        <w:t xml:space="preserve"> structure so the team could start sharing experiment logs. This took about 2 hours. </w:t>
-      </w:r>
-    </w:p>
-    <w:p>
-      <w:pPr>
-        <w:spacing w:before="240" w:after="240"/>
-      </w:pPr>
-      <w:r>
-        <w:t xml:space="preserve">Jia Ler worked on the GUI design. He created the wireframes for the application, </w:t>
-      </w:r>
-      <w:r>
-        <w:t xml:space="preserve">laying out how the overall GUI might look like and </w:t>
-      </w:r>
-      <w:r>
-        <w:t xml:space="preserve">mapping out what inputs </w:t>
-      </w:r>
-      <w:r>
-        <w:t>can be</w:t>
-      </w:r>
-      <w:r>
-        <w:t xml:space="preserve"> </w:t>
-      </w:r>
-      <w:r>
-        <w:t>implemented</w:t>
-      </w:r>
-      <w:r>
-        <w:t xml:space="preserve"> for both the batch processing and </w:t>
-      </w:r>
-      <w:r>
-        <w:t xml:space="preserve">real-time </w:t>
-      </w:r>
-      <w:r>
-        <w:t>modes</w:t>
-      </w:r>
-      <w:r>
-        <w:t xml:space="preserve"> potentially</w:t>
-      </w:r>
-      <w:r>
-        <w:t>. This took about 2 hours.</w:t>
-      </w:r>
-    </w:p>
-    <w:p>
-      <w:pPr>
-        <w:spacing w:before="240" w:after="240"/>
-      </w:pPr>
-      <w:r>
-        <w:rPr>
-          <w:b/>
-          <w:bCs/>
-        </w:rPr>
-        <w:t>2. Why did some tasks take longer than expected?</w:t>
-      </w:r>
-      <w:r>
-        <w:t xml:space="preserve"> </w:t>
-      </w:r>
-    </w:p>
-    <w:p>
-      <w:pPr>
-        <w:spacing w:before="240" w:after="240"/>
-      </w:pPr>
-      <w:r>
-        <w:t>Thomas's ETL task took longer than the others (4 hours) because the logic to handle duplicate primary keys during the append process was more complex than initially thought, requiring a partial rewrite of the ingestion script.</w:t>
-      </w:r>
-    </w:p>
-    <w:p>
-      <w:pPr>
-        <w:spacing w:before="240" w:after="240"/>
-      </w:pPr>
-      <w:r>
-        <w:rPr>
-          <w:b/>
-          <w:bCs/>
-        </w:rPr>
-        <w:t>3. What is the backlog status and are there any blockers?</w:t>
-      </w:r>
-      <w:r>
-        <w:t xml:space="preserve"> </w:t>
-      </w:r>
-    </w:p>
-    <w:p>
-      <w:pPr>
-        <w:spacing w:before="240" w:after="240"/>
-      </w:pPr>
-      <w:r>
-        <w:t>We currently have 12 tasks remaining on the board. We decided to add a specific task for "Handle Class Imbalance" because we noticed the dataset has a 1:3 ratio of dangerous to safe drivers, which might skew our results if ignored. There are no major blockers, though Thomas noted the ETL fix was trickier than expected due to duplicate primary keys.</w:t>
-      </w:r>
-    </w:p>
-    <w:p>
-      <w:pPr>
-        <w:spacing w:before="240" w:after="240"/>
-      </w:pPr>
-      <w:r>
-        <w:rPr>
-          <w:b/>
-          <w:bCs/>
-        </w:rPr>
-        <w:t>4. What are the next tasks?</w:t>
-      </w:r>
-    </w:p>
-    <w:p>
-      <w:pPr>
-        <w:spacing w:before="240" w:after="240"/>
-      </w:pPr>
-      <w:r>
-        <w:t xml:space="preserve">Thomas will move on to doing further data analysis and training with a wider variety of models (e.g., Random Forest, </w:t>
-      </w:r>
-      <w:proofErr w:type="spellStart"/>
-      <w:r>
-        <w:t>XGBoost</w:t>
-      </w:r>
-      <w:proofErr w:type="spellEnd"/>
-      <w:r>
-        <w:t xml:space="preserve">, </w:t>
-      </w:r>
-      <w:proofErr w:type="spellStart"/>
-      <w:r>
-        <w:t>LightGBM</w:t>
-      </w:r>
-      <w:proofErr w:type="spellEnd"/>
-      <w:r>
-        <w:t>) to benchmark performance. Lin Kai will start training the baseline logistic regression model and experimenting with class imbalance techniques; he will also assist Thomas with training the various advanced models once his part is done. Jia Ler will start coding the actual GUI shell and the batch processing logic.</w:t>
-      </w:r>
-    </w:p>
-    <w:p>
-      <w:pPr>
-        <w:spacing w:before="240" w:after="240"/>
-        <w:rPr>
-          <w:b/>
-          <w:bCs/>
-        </w:rPr>
-      </w:pPr>
-    </w:p>
-    <w:p>
-      <w:pPr>
-        <w:spacing w:before="240" w:after="240"/>
-        <w:rPr>
-          <w:b/>
-          <w:bCs/>
-        </w:rPr>
-      </w:pPr>
-    </w:p>
-    <w:p>
-      <w:pPr>
-        <w:spacing w:before="240" w:after="240"/>
-        <w:rPr>
-          <w:b/>
-          <w:bCs/>
-        </w:rPr>
-      </w:pPr>
-    </w:p>
-    <w:p>
-      <w:pPr>
-        <w:spacing w:before="240" w:after="240"/>
-        <w:rPr>
-          <w:b/>
-          <w:bCs/>
+        <w:t xml:space="preserve">Module: </w:t>
+      </w:r>
+      <w:r>
+        <w:rPr>
           <w:sz w:val="24"/>
           <w:szCs w:val="24"/>
-        </w:rPr>
-      </w:pPr>
-    </w:p>
-    <w:p>
-      <w:pPr>
-        <w:spacing w:before="240" w:after="240"/>
-        <w:rPr>
-          <w:b/>
-          <w:bCs/>
+          <w:u w:val="single"/>
+        </w:rPr>
+        <w:t>ST1508 Practical AI</w:t>
+      </w:r>
+      <w:r>
+        <w:rPr>
           <w:sz w:val="24"/>
           <w:szCs w:val="24"/>
         </w:rPr>
-      </w:pPr>
-      <w:r>
-        <w:rPr>
-          <w:b/>
-          <w:bCs/>
+        <w:br/>
+        <w:t xml:space="preserve">Assessment: </w:t>
+      </w:r>
+      <w:r>
+        <w:rPr>
           <w:sz w:val="24"/>
           <w:szCs w:val="24"/>
+          <w:u w:val="single"/>
+        </w:rPr>
+        <w:t>CA1</w:t>
+      </w:r>
+      <w:r>
+        <w:rPr>
+          <w:sz w:val="24"/>
+          <w:szCs w:val="24"/>
+        </w:rPr>
+        <w:br/>
+        <w:t xml:space="preserve">Team Members: </w:t>
+      </w:r>
+      <w:r>
+        <w:rPr>
+          <w:sz w:val="24"/>
+          <w:szCs w:val="24"/>
+          <w:u w:val="single"/>
+        </w:rPr>
+        <w:t>Lin Kai, Jia Ler, Thomas</w:t>
+      </w:r>
+    </w:p>
+    <w:p>
+      <w:pPr>
+        <w:rPr>
+          <w:b/>
+          <w:bCs/>
+          <w:sz w:val="24"/>
+          <w:szCs w:val="24"/>
+        </w:rPr>
+      </w:pPr>
+      <w:r>
+        <w:pict w14:anchorId="2730DC80">
+          <v:rect id="_x0000_i1034" style="width:0;height:1.5pt" o:hralign="center" o:hrstd="t" o:hr="t" fillcolor="#a0a0a0" stroked="f"/>
+        </w:pict>
+      </w:r>
+    </w:p>
+    <w:p/>
+    <w:p>
+      <w:pPr>
+        <w:rPr>
+          <w:b/>
+          <w:bCs/>
+          <w:sz w:val="40"/>
+          <w:szCs w:val="40"/>
+        </w:rPr>
+      </w:pPr>
+      <w:r>
+        <w:rPr>
+          <w:b/>
+          <w:bCs/>
+          <w:sz w:val="40"/>
+          <w:szCs w:val="40"/>
+        </w:rPr>
+        <w:t>Section 1</w:t>
+      </w:r>
+      <w:r>
+        <w:rPr>
+          <w:b/>
+          <w:bCs/>
+          <w:sz w:val="40"/>
+          <w:szCs w:val="40"/>
+        </w:rPr>
+        <w:t xml:space="preserve"> – U</w:t>
+      </w:r>
+      <w:r>
+        <w:rPr>
+          <w:b/>
+          <w:bCs/>
+          <w:sz w:val="40"/>
+          <w:szCs w:val="40"/>
+        </w:rPr>
+        <w:t>ser Stories</w:t>
+      </w:r>
+    </w:p>
+    <w:p>
+      <w:pPr>
+        <w:rPr>
+          <w:lang w:val="en-US"/>
+        </w:rPr>
+      </w:pPr>
+    </w:p>
+    <w:p>
+      <w:pPr>
+        <w:spacing w:line="480" w:lineRule="auto"/>
+        <w:rPr>
+          <w:b/>
+          <w:bCs/>
+          <w:lang w:val="en-US"/>
+        </w:rPr>
+      </w:pPr>
+      <w:r>
+        <w:rPr>
+          <w:b/>
+          <w:bCs/>
+          <w:lang w:val="en-US"/>
+        </w:rPr>
+        <w:t>User Story 1: Operations Manager</w:t>
+      </w:r>
+    </w:p>
+    <w:p>
+      <w:pPr>
+        <w:rPr>
+          <w:lang w:val="en-US"/>
+        </w:rPr>
+      </w:pPr>
+      <w:r>
+        <w:rPr>
+          <w:lang w:val="en-US"/>
+        </w:rPr>
+        <w:t>As an Operations Manager,</w:t>
+      </w:r>
+      <w:r>
+        <w:rPr>
+          <w:lang w:val="en-US"/>
+        </w:rPr>
+        <w:t xml:space="preserve"> </w:t>
+      </w:r>
+      <w:r>
+        <w:rPr>
+          <w:lang w:val="en-US"/>
+        </w:rPr>
+        <w:t>I need to upload a batch file of sensor data into a desktop application,</w:t>
+      </w:r>
+      <w:r>
+        <w:rPr>
+          <w:lang w:val="en-US"/>
+        </w:rPr>
+        <w:t xml:space="preserve"> s</w:t>
+      </w:r>
+      <w:r>
+        <w:rPr>
+          <w:lang w:val="en-US"/>
+        </w:rPr>
+        <w:t>o that I can automatically identify reckless drivers from the previous week without performing manual analysis.</w:t>
+      </w:r>
+    </w:p>
+    <w:p>
+      <w:pPr>
+        <w:rPr>
+          <w:lang w:val="en-US"/>
+        </w:rPr>
+      </w:pPr>
+    </w:p>
+    <w:p>
+      <w:pPr>
+        <w:spacing w:line="480" w:lineRule="auto"/>
+        <w:rPr>
+          <w:b/>
+          <w:bCs/>
+          <w:lang w:val="en-US"/>
+        </w:rPr>
+      </w:pPr>
+      <w:r>
+        <w:rPr>
+          <w:b/>
+          <w:bCs/>
+          <w:lang w:val="en-US"/>
+        </w:rPr>
+        <w:t>User Story 2: Safety Analyst</w:t>
+      </w:r>
+    </w:p>
+    <w:p>
+      <w:pPr>
+        <w:rPr>
+          <w:lang w:val="en-US"/>
+        </w:rPr>
+      </w:pPr>
+      <w:r>
+        <w:rPr>
+          <w:lang w:val="en-US"/>
+        </w:rPr>
+        <w:t>As a Safety Analyst,</w:t>
+      </w:r>
+      <w:r>
+        <w:rPr>
+          <w:lang w:val="en-US"/>
+        </w:rPr>
+        <w:t xml:space="preserve"> </w:t>
+      </w:r>
+      <w:r>
+        <w:rPr>
+          <w:lang w:val="en-US"/>
+        </w:rPr>
+        <w:t>I need to input specific sensor readings into a GUI form,</w:t>
+      </w:r>
+      <w:r>
+        <w:rPr>
+          <w:lang w:val="en-US"/>
+        </w:rPr>
+        <w:t xml:space="preserve"> s</w:t>
+      </w:r>
+      <w:r>
+        <w:rPr>
+          <w:lang w:val="en-US"/>
+        </w:rPr>
+        <w:t>o that I can instantly assess if a specific trip was dangerous during driver incident reviews.</w:t>
+      </w:r>
+    </w:p>
+    <w:p>
+      <w:pPr>
+        <w:rPr>
+          <w:lang w:val="en-US"/>
+        </w:rPr>
+      </w:pPr>
+    </w:p>
+    <w:p>
+      <w:pPr>
+        <w:spacing w:line="480" w:lineRule="auto"/>
+        <w:rPr>
+          <w:b/>
+          <w:bCs/>
+          <w:lang w:val="en-US"/>
+        </w:rPr>
+      </w:pPr>
+      <w:r>
+        <w:rPr>
+          <w:b/>
+          <w:bCs/>
+          <w:lang w:val="en-US"/>
+        </w:rPr>
+        <w:t>User Story 3: Risk Officer</w:t>
+      </w:r>
+    </w:p>
+    <w:p>
+      <w:pPr>
+        <w:rPr>
+          <w:lang w:val="en-US"/>
+        </w:rPr>
+      </w:pPr>
+      <w:r>
+        <w:rPr>
+          <w:lang w:val="en-US"/>
+        </w:rPr>
+        <w:t>As a Risk Officer,</w:t>
+      </w:r>
+      <w:r>
+        <w:rPr>
+          <w:lang w:val="en-US"/>
+        </w:rPr>
+        <w:t xml:space="preserve"> </w:t>
+      </w:r>
+      <w:r>
+        <w:rPr>
+          <w:lang w:val="en-US"/>
+        </w:rPr>
+        <w:t>I need the AI model to be tuned for high recall (minimizing missed detections),</w:t>
+      </w:r>
+      <w:r>
+        <w:rPr>
+          <w:lang w:val="en-US"/>
+        </w:rPr>
+        <w:t xml:space="preserve"> s</w:t>
+      </w:r>
+      <w:r>
+        <w:rPr>
+          <w:lang w:val="en-US"/>
+        </w:rPr>
+        <w:t>o that we do not accidentally classify a dangerous driver as "safe" and risk passenger safety.</w:t>
+      </w:r>
+    </w:p>
+    <w:p>
+      <w:pPr>
+        <w:rPr>
+          <w:lang w:val="en-US"/>
+        </w:rPr>
+      </w:pPr>
+    </w:p>
+    <w:p>
+      <w:pPr>
+        <w:spacing w:line="480" w:lineRule="auto"/>
+        <w:rPr>
+          <w:b/>
+          <w:bCs/>
+          <w:lang w:val="en-US"/>
+        </w:rPr>
+      </w:pPr>
+      <w:r>
+        <w:rPr>
+          <w:b/>
+          <w:bCs/>
+          <w:lang w:val="en-US"/>
+        </w:rPr>
+        <w:t>User Story 4: Company Manager</w:t>
+      </w:r>
+    </w:p>
+    <w:p>
+      <w:pPr>
+        <w:rPr>
+          <w:lang w:val="en-US"/>
+        </w:rPr>
+      </w:pPr>
+      <w:r>
+        <w:rPr>
+          <w:lang w:val="en-US"/>
+        </w:rPr>
+        <w:t>As a Company Manager,</w:t>
+      </w:r>
+      <w:r>
+        <w:rPr>
+          <w:lang w:val="en-US"/>
+        </w:rPr>
+        <w:t xml:space="preserve"> </w:t>
+      </w:r>
+      <w:r>
+        <w:rPr>
+          <w:lang w:val="en-US"/>
+        </w:rPr>
+        <w:t>I need a user-friendly desktop application (GUI) that runs offline,</w:t>
+      </w:r>
+      <w:r>
+        <w:rPr>
+          <w:lang w:val="en-US"/>
+        </w:rPr>
+        <w:t xml:space="preserve"> s</w:t>
+      </w:r>
+      <w:r>
+        <w:rPr>
+          <w:lang w:val="en-US"/>
+        </w:rPr>
+        <w:t>o that my non-technical staff can use the AI system easily without needing Python knowledge.</w:t>
+      </w:r>
+    </w:p>
+    <w:p>
+      <w:pPr>
+        <w:rPr>
+          <w:lang w:val="en-US"/>
+        </w:rPr>
+      </w:pPr>
+    </w:p>
+    <w:p>
+      <w:pPr>
+        <w:rPr>
+          <w:lang w:val="en-US"/>
+        </w:rPr>
+      </w:pPr>
+    </w:p>
+    <w:p>
+      <w:pPr>
+        <w:rPr>
+          <w:lang w:val="en-US"/>
+        </w:rPr>
+      </w:pPr>
+    </w:p>
+    <w:p>
+      <w:pPr>
+        <w:rPr>
+          <w:lang w:val="en-US"/>
+        </w:rPr>
+      </w:pPr>
+    </w:p>
+    <w:p>
+      <w:pPr>
+        <w:rPr>
+          <w:lang w:val="en-US"/>
+        </w:rPr>
+      </w:pPr>
+    </w:p>
+    <w:p>
+      <w:pPr>
+        <w:rPr>
+          <w:lang w:val="en-US"/>
+        </w:rPr>
+      </w:pPr>
+    </w:p>
+    <w:p>
+      <w:pPr>
+        <w:rPr>
+          <w:lang w:val="en-US"/>
+        </w:rPr>
+      </w:pPr>
+    </w:p>
+    <w:p>
+      <w:pPr>
+        <w:rPr>
+          <w:lang w:val="en-US"/>
+        </w:rPr>
+      </w:pPr>
+    </w:p>
+    <w:p>
+      <w:pPr>
+        <w:rPr>
+          <w:lang w:val="en-US"/>
+        </w:rPr>
+      </w:pPr>
+    </w:p>
+    <w:p>
+      <w:pPr>
+        <w:rPr>
+          <w:lang w:val="en-US"/>
+        </w:rPr>
+      </w:pPr>
+    </w:p>
+    <w:p>
+      <w:pPr>
+        <w:rPr>
+          <w:lang w:val="en-US"/>
+        </w:rPr>
+      </w:pPr>
+    </w:p>
+    <w:p>
+      <w:pPr>
+        <w:rPr>
+          <w:lang w:val="en-US"/>
+        </w:rPr>
+      </w:pPr>
+    </w:p>
+    <w:p>
+      <w:pPr>
+        <w:rPr>
+          <w:lang w:val="en-US"/>
+        </w:rPr>
+      </w:pPr>
+    </w:p>
+    <w:p>
+      <w:pPr>
+        <w:rPr>
+          <w:lang w:val="en-US"/>
+        </w:rPr>
+      </w:pPr>
+    </w:p>
+    <w:p>
+      <w:pPr>
+        <w:rPr>
+          <w:b/>
+          <w:bCs/>
+          <w:sz w:val="40"/>
+          <w:szCs w:val="40"/>
+        </w:rPr>
+      </w:pPr>
+    </w:p>
+    <w:p>
+      <w:pPr>
+        <w:rPr>
+          <w:b/>
+          <w:bCs/>
+          <w:sz w:val="40"/>
+          <w:szCs w:val="40"/>
+        </w:rPr>
+      </w:pPr>
+    </w:p>
+    <w:p>
+      <w:pPr>
+        <w:rPr>
+          <w:b/>
+          <w:bCs/>
+          <w:sz w:val="40"/>
+          <w:szCs w:val="40"/>
+        </w:rPr>
+      </w:pPr>
+      <w:r>
+        <w:rPr>
+          <w:b/>
+          <w:bCs/>
+          <w:sz w:val="40"/>
+          <w:szCs w:val="40"/>
+        </w:rPr>
+        <w:lastRenderedPageBreak/>
+        <w:t xml:space="preserve">Section </w:t>
+      </w:r>
+      <w:r>
+        <w:rPr>
+          <w:b/>
+          <w:bCs/>
+          <w:sz w:val="40"/>
+          <w:szCs w:val="40"/>
+        </w:rPr>
+        <w:t>2</w:t>
+      </w:r>
+      <w:r>
+        <w:rPr>
+          <w:b/>
+          <w:bCs/>
+          <w:sz w:val="40"/>
+          <w:szCs w:val="40"/>
+        </w:rPr>
+        <w:t xml:space="preserve"> </w:t>
+      </w:r>
+      <w:r>
+        <w:rPr>
+          <w:b/>
+          <w:bCs/>
+          <w:sz w:val="40"/>
+          <w:szCs w:val="40"/>
+        </w:rPr>
+        <w:t>– Scrum Meetings</w:t>
+      </w:r>
+    </w:p>
+    <w:p>
+      <w:pPr>
+        <w:spacing w:before="240" w:after="240" w:line="240" w:lineRule="auto"/>
+        <w:rPr>
+          <w:b/>
+          <w:bCs/>
+          <w:sz w:val="24"/>
+          <w:szCs w:val="24"/>
+        </w:rPr>
+      </w:pPr>
+      <w:r>
+        <w:rPr>
+          <w:b/>
+          <w:bCs/>
+          <w:sz w:val="24"/>
+          <w:szCs w:val="24"/>
+        </w:rPr>
+        <w:t>Weekly Scrum Meeting 1 (Sprint 1 Review &amp; Sprint 2 Planning)</w:t>
+      </w:r>
+    </w:p>
+    <w:p>
+      <w:pPr>
+        <w:spacing w:before="240" w:after="240" w:line="240" w:lineRule="auto"/>
+      </w:pPr>
+      <w:r>
+        <w:rPr>
+          <w:b/>
+          <w:bCs/>
+        </w:rPr>
+        <w:t>Date:</w:t>
+      </w:r>
+      <w:r>
+        <w:t xml:space="preserve"> 21 Jan 2026 </w:t>
+      </w:r>
+    </w:p>
+    <w:p>
+      <w:pPr>
+        <w:spacing w:before="240" w:after="240" w:line="240" w:lineRule="auto"/>
+      </w:pPr>
+      <w:r>
+        <w:rPr>
+          <w:b/>
+          <w:bCs/>
+        </w:rPr>
+        <w:t>Duration:</w:t>
+      </w:r>
+      <w:r>
+        <w:t xml:space="preserve"> ~10 mins</w:t>
+      </w:r>
+    </w:p>
+    <w:p>
+      <w:pPr>
+        <w:spacing w:before="240" w:after="240"/>
+      </w:pPr>
+      <w:r>
+        <w:rPr>
+          <w:b/>
+          <w:bCs/>
+        </w:rPr>
+        <w:t>1. What tasks were completed by each person?</w:t>
+      </w:r>
+      <w:r>
+        <w:t xml:space="preserve">  </w:t>
+      </w:r>
+    </w:p>
+    <w:p>
+      <w:pPr>
+        <w:spacing w:before="240" w:after="240"/>
+      </w:pPr>
+      <w:r>
+        <w:t xml:space="preserve">Thomas focused on fixing the ETL pipeline. He realized the original script couldn't handle new incoming data rows without crashing, so he refactored the logic to check for existing booking IDs before appending. This took him about 4 hours. </w:t>
+      </w:r>
+    </w:p>
+    <w:p>
+      <w:pPr>
+        <w:spacing w:before="240" w:after="240"/>
+      </w:pPr>
+      <w:r>
+        <w:t>Lin Kai handled the project initialization. He set up the GitHub repository</w:t>
+      </w:r>
+      <w:r>
+        <w:t xml:space="preserve"> and tested local </w:t>
+      </w:r>
+      <w:proofErr w:type="spellStart"/>
+      <w:r>
+        <w:t>MLflow</w:t>
+      </w:r>
+      <w:proofErr w:type="spellEnd"/>
+      <w:r>
+        <w:t xml:space="preserve"> functionality on his own laptop first. Then he </w:t>
+      </w:r>
+      <w:r>
+        <w:t>configu</w:t>
+      </w:r>
+      <w:r>
+        <w:t>res</w:t>
+      </w:r>
+      <w:r>
+        <w:t xml:space="preserve"> </w:t>
+      </w:r>
+      <w:r>
+        <w:t xml:space="preserve">the local </w:t>
+      </w:r>
+      <w:proofErr w:type="spellStart"/>
+      <w:r>
+        <w:t>MLflow</w:t>
+      </w:r>
+      <w:proofErr w:type="spellEnd"/>
+      <w:r>
+        <w:t xml:space="preserve"> folder</w:t>
+      </w:r>
+      <w:r>
+        <w:t xml:space="preserve"> structure so the team could start sharing experiment logs. This took about 2 hours. </w:t>
+      </w:r>
+    </w:p>
+    <w:p>
+      <w:pPr>
+        <w:spacing w:before="240" w:after="240"/>
+      </w:pPr>
+      <w:r>
+        <w:t xml:space="preserve">Jia Ler worked on the GUI design. He created the wireframes for the application, </w:t>
+      </w:r>
+      <w:r>
+        <w:t xml:space="preserve">laying out how the overall GUI might look like and </w:t>
+      </w:r>
+      <w:r>
+        <w:t xml:space="preserve">mapping out what inputs </w:t>
+      </w:r>
+      <w:r>
+        <w:t>can be</w:t>
+      </w:r>
+      <w:r>
+        <w:t xml:space="preserve"> </w:t>
+      </w:r>
+      <w:r>
+        <w:t>implemented</w:t>
+      </w:r>
+      <w:r>
+        <w:t xml:space="preserve"> for both the batch processing and </w:t>
+      </w:r>
+      <w:r>
+        <w:t xml:space="preserve">real-time </w:t>
+      </w:r>
+      <w:r>
+        <w:t>modes</w:t>
+      </w:r>
+      <w:r>
+        <w:t xml:space="preserve"> potentially</w:t>
+      </w:r>
+      <w:r>
+        <w:t>. This took about 2 hours.</w:t>
+      </w:r>
+    </w:p>
+    <w:p>
+      <w:pPr>
+        <w:spacing w:before="240" w:after="240"/>
+      </w:pPr>
+      <w:r>
+        <w:rPr>
+          <w:b/>
+          <w:bCs/>
+        </w:rPr>
+        <w:t>2. Why did some tasks take longer than expected?</w:t>
+      </w:r>
+      <w:r>
+        <w:t xml:space="preserve"> </w:t>
+      </w:r>
+    </w:p>
+    <w:p>
+      <w:pPr>
+        <w:spacing w:before="240" w:after="240"/>
+      </w:pPr>
+      <w:r>
+        <w:t>Thomas's ETL task took longer than the others (4 hours) because the logic to handle duplicate primary keys during the append process was more complex than initially thought, requiring a partial rewrite of the ingestion script.</w:t>
+      </w:r>
+    </w:p>
+    <w:p>
+      <w:pPr>
+        <w:spacing w:before="240" w:after="240"/>
+      </w:pPr>
+      <w:r>
+        <w:rPr>
+          <w:b/>
+          <w:bCs/>
+        </w:rPr>
+        <w:t>3. What is the backlog status and are there any blockers?</w:t>
+      </w:r>
+      <w:r>
+        <w:t xml:space="preserve"> </w:t>
+      </w:r>
+    </w:p>
+    <w:p>
+      <w:pPr>
+        <w:spacing w:before="240" w:after="240"/>
+      </w:pPr>
+      <w:r>
+        <w:t>We currently have 12 tasks remaining on the board. We decided to add a specific task for "Handle Class Imbalance" because we noticed the dataset has a 1:3 ratio of dangerous to safe drivers, which might skew our results if ignored. There are no major blockers, though Thomas noted the ETL fix was trickier than expected due to duplicate primary keys.</w:t>
+      </w:r>
+    </w:p>
+    <w:p>
+      <w:pPr>
+        <w:spacing w:before="240" w:after="240"/>
+      </w:pPr>
+      <w:r>
+        <w:rPr>
+          <w:b/>
+          <w:bCs/>
+        </w:rPr>
+        <w:t>4. What are the next tasks?</w:t>
+      </w:r>
+    </w:p>
+    <w:p>
+      <w:pPr>
+        <w:spacing w:before="240" w:after="240"/>
+      </w:pPr>
+      <w:r>
+        <w:t xml:space="preserve">Thomas will move on to doing further data analysis and training with a wider variety of models (e.g., Random Forest, </w:t>
+      </w:r>
+      <w:proofErr w:type="spellStart"/>
+      <w:r>
+        <w:t>XGBoost</w:t>
+      </w:r>
+      <w:proofErr w:type="spellEnd"/>
+      <w:r>
+        <w:t xml:space="preserve">, </w:t>
+      </w:r>
+      <w:proofErr w:type="spellStart"/>
+      <w:r>
+        <w:t>LightGBM</w:t>
+      </w:r>
+      <w:proofErr w:type="spellEnd"/>
+      <w:r>
+        <w:t>) to benchmark performance. Lin Kai will start training the baseline logistic regression model and experimenting with class imbalance techniques; he will also assist Thomas with training the various advanced models once his part is done. Jia Ler will start coding the actual GUI shell and the batch processing logic.</w:t>
+      </w:r>
+    </w:p>
+    <w:p>
+      <w:pPr>
+        <w:spacing w:before="240" w:after="240"/>
+        <w:rPr>
+          <w:b/>
+          <w:bCs/>
+        </w:rPr>
+      </w:pPr>
+    </w:p>
+    <w:p>
+      <w:pPr>
+        <w:spacing w:before="240" w:after="240"/>
+        <w:rPr>
+          <w:b/>
+          <w:bCs/>
+        </w:rPr>
+      </w:pPr>
+    </w:p>
+    <w:p>
+      <w:pPr>
+        <w:spacing w:before="240" w:after="240"/>
+        <w:rPr>
+          <w:b/>
+          <w:bCs/>
+        </w:rPr>
+      </w:pPr>
+    </w:p>
+    <w:p>
+      <w:pPr>
+        <w:spacing w:before="240" w:after="240"/>
+        <w:rPr>
+          <w:b/>
+          <w:bCs/>
+          <w:sz w:val="24"/>
+          <w:szCs w:val="24"/>
+        </w:rPr>
+      </w:pPr>
+    </w:p>
+    <w:p>
+      <w:pPr>
+        <w:spacing w:before="240" w:after="240"/>
+        <w:rPr>
+          <w:b/>
+          <w:bCs/>
+          <w:sz w:val="24"/>
+          <w:szCs w:val="24"/>
+        </w:rPr>
+      </w:pPr>
+      <w:r>
+        <w:rPr>
+          <w:b/>
+          <w:bCs/>
+          <w:sz w:val="24"/>
+          <w:szCs w:val="24"/>
         </w:rPr>
         <w:lastRenderedPageBreak/>
         <w:t>Weekly Scrum Meeting 2</w:t>
@@ -396,19 +915,7 @@
         <w:rPr>
           <w:lang w:val="en-US"/>
         </w:rPr>
-        <w:t xml:space="preserve">Lin Kai completed the imbalance handling experiments and assisted Thomas with the model training phase. He found that simple threshold tuning worked best for stability. Thomas completed the training and evaluation of multiple model </w:t>
-      </w:r>
-      <w:r>
-        <w:rPr>
-          <w:lang w:val="en-US"/>
-        </w:rPr>
-        <w:t>architecture</w:t>
-      </w:r>
-      <w:r>
-        <w:rPr>
-          <w:lang w:val="en-US"/>
-        </w:rPr>
-        <w:t xml:space="preserve"> (Random Forest, </w:t>
+        <w:t xml:space="preserve">Lin Kai completed the imbalance handling experiments and assisted Thomas with the model training phase. He found that simple threshold tuning worked best for stability. Thomas completed the training and evaluation of multiple model architecture (Random Forest, </w:t>
       </w:r>
       <w:proofErr w:type="spellStart"/>
       <w:r>
@@ -553,13 +1060,7 @@
         </w:rPr>
       </w:pPr>
       <w:r>
-        <w:t xml:space="preserve">Thomas will continue to </w:t>
-      </w:r>
-      <w:r>
-        <w:t>investigate</w:t>
-      </w:r>
-      <w:r>
-        <w:t xml:space="preserve"> the model evaluation part a bit more to understand the root cause of the performance stagnation</w:t>
+        <w:t>Thomas will continue to investigate the model evaluation part a bit more to understand the root cause of the performance stagnation</w:t>
       </w:r>
       <w:r>
         <w:t xml:space="preserve"> and maybe start writing the initial model report</w:t>
@@ -577,6 +1078,619 @@
     </w:sectPr>
   </w:body>
 </w:document>
+</file>
+
+<file path=word/numbering.xml><?xml version="1.0" encoding="utf-8"?>
+<w:numbering xmlns:wpc="http://schemas.microsoft.com/office/word/2010/wordprocessingCanvas" xmlns:cx="http://schemas.microsoft.com/office/drawing/2014/chartex" xmlns:cx1="http://schemas.microsoft.com/office/drawing/2015/9/8/chartex" xmlns:cx2="http://schemas.microsoft.com/office/drawing/2015/10/21/chartex" xmlns:cx3="http://schemas.microsoft.com/office/drawing/2016/5/9/chartex" xmlns:cx4="http://schemas.microsoft.com/office/drawing/2016/5/10/chartex" xmlns:cx5="http://schemas.microsoft.com/office/drawing/2016/5/11/chartex" xmlns:cx6="http://schemas.microsoft.com/office/drawing/2016/5/12/chartex" xmlns:cx7="http://schemas.microsoft.com/office/drawing/2016/5/13/chartex" xmlns:cx8="http://schemas.microsoft.com/office/drawing/2016/5/14/chartex" xmlns:mc="http://schemas.openxmlformats.org/markup-compatibility/2006" xmlns:aink="http://schemas.microsoft.com/office/drawing/2016/ink" xmlns:am3d="http://schemas.microsoft.com/office/drawing/2017/model3d" xmlns:o="urn:schemas-microsoft-com:office:office" xmlns:oel="http://schemas.microsoft.com/office/2019/extlst" xmlns:r="http://schemas.openxmlformats.org/officeDocument/2006/relationships" xmlns:m="http://schemas.openxmlformats.org/officeDocument/2006/math" xmlns:v="urn:schemas-microsoft-com:vml" xmlns:wp14="http://schemas.microsoft.com/office/word/2010/wordprocessingDrawing" xmlns:wp="http://schemas.openxmlformats.org/drawingml/2006/wordprocessingDrawing" xmlns:w10="urn:schemas-microsoft-com:office:word" xmlns:w="http://schemas.openxmlformats.org/wordprocessingml/2006/main" xmlns:w14="http://schemas.microsoft.com/office/word/2010/wordml" xmlns:w15="http://schemas.microsoft.com/office/word/2012/wordml" xmlns:w16cex="http://schemas.microsoft.com/office/word/2018/wordml/cex" xmlns:w16cid="http://schemas.microsoft.com/office/word/2016/wordml/cid" xmlns:w16="http://schemas.microsoft.com/office/word/2018/wordml" xmlns:w16du="http://schemas.microsoft.com/office/word/2023/wordml/word16du" xmlns:w16sdtdh="http://schemas.microsoft.com/office/word/2020/wordml/sdtdatahash" xmlns:w16sdtfl="http://schemas.microsoft.com/office/word/2024/wordml/sdtformatlock" xmlns:w16se="http://schemas.microsoft.com/office/word/2015/wordml/symex" xmlns:wpg="http://schemas.microsoft.com/office/word/2010/wordprocessingGroup" xmlns:wpi="http://schemas.microsoft.com/office/word/2010/wordprocessingInk" xmlns:wne="http://schemas.microsoft.com/office/word/2006/wordml" xmlns:wps="http://schemas.microsoft.com/office/word/2010/wordprocessingShape" mc:Ignorable="w14 w15 w16se w16cid w16 w16cex w16sdtdh w16sdtfl w16du wp14">
+  <w:abstractNum w:abstractNumId="0" w15:restartNumberingAfterBreak="0">
+    <w:nsid w:val="2BA21CB1"/>
+    <w:multiLevelType w:val="multilevel"/>
+    <w:tmpl w:val="D5A47220"/>
+    <w:lvl w:ilvl="0">
+      <w:start w:val="1"/>
+      <w:numFmt w:val="bullet"/>
+      <w:lvlText w:val=""/>
+      <w:lvlJc w:val="left"/>
+      <w:pPr>
+        <w:tabs>
+          <w:tab w:val="num" w:pos="720"/>
+        </w:tabs>
+        <w:ind w:left="720" w:hanging="360"/>
+      </w:pPr>
+      <w:rPr>
+        <w:rFonts w:ascii="Symbol" w:hAnsi="Symbol" w:hint="default"/>
+        <w:sz w:val="20"/>
+      </w:rPr>
+    </w:lvl>
+    <w:lvl w:ilvl="1" w:tentative="1">
+      <w:start w:val="1"/>
+      <w:numFmt w:val="bullet"/>
+      <w:lvlText w:val="o"/>
+      <w:lvlJc w:val="left"/>
+      <w:pPr>
+        <w:tabs>
+          <w:tab w:val="num" w:pos="1440"/>
+        </w:tabs>
+        <w:ind w:left="1440" w:hanging="360"/>
+      </w:pPr>
+      <w:rPr>
+        <w:rFonts w:ascii="Courier New" w:hAnsi="Courier New" w:hint="default"/>
+        <w:sz w:val="20"/>
+      </w:rPr>
+    </w:lvl>
+    <w:lvl w:ilvl="2" w:tentative="1">
+      <w:start w:val="1"/>
+      <w:numFmt w:val="bullet"/>
+      <w:lvlText w:val=""/>
+      <w:lvlJc w:val="left"/>
+      <w:pPr>
+        <w:tabs>
+          <w:tab w:val="num" w:pos="2160"/>
+        </w:tabs>
+        <w:ind w:left="2160" w:hanging="360"/>
+      </w:pPr>
+      <w:rPr>
+        <w:rFonts w:ascii="Wingdings" w:hAnsi="Wingdings" w:hint="default"/>
+        <w:sz w:val="20"/>
+      </w:rPr>
+    </w:lvl>
+    <w:lvl w:ilvl="3" w:tentative="1">
+      <w:start w:val="1"/>
+      <w:numFmt w:val="bullet"/>
+      <w:lvlText w:val=""/>
+      <w:lvlJc w:val="left"/>
+      <w:pPr>
+        <w:tabs>
+          <w:tab w:val="num" w:pos="2880"/>
+        </w:tabs>
+        <w:ind w:left="2880" w:hanging="360"/>
+      </w:pPr>
+      <w:rPr>
+        <w:rFonts w:ascii="Wingdings" w:hAnsi="Wingdings" w:hint="default"/>
+        <w:sz w:val="20"/>
+      </w:rPr>
+    </w:lvl>
+    <w:lvl w:ilvl="4" w:tentative="1">
+      <w:start w:val="1"/>
+      <w:numFmt w:val="bullet"/>
+      <w:lvlText w:val=""/>
+      <w:lvlJc w:val="left"/>
+      <w:pPr>
+        <w:tabs>
+          <w:tab w:val="num" w:pos="3600"/>
+        </w:tabs>
+        <w:ind w:left="3600" w:hanging="360"/>
+      </w:pPr>
+      <w:rPr>
+        <w:rFonts w:ascii="Wingdings" w:hAnsi="Wingdings" w:hint="default"/>
+        <w:sz w:val="20"/>
+      </w:rPr>
+    </w:lvl>
+    <w:lvl w:ilvl="5" w:tentative="1">
+      <w:start w:val="1"/>
+      <w:numFmt w:val="bullet"/>
+      <w:lvlText w:val=""/>
+      <w:lvlJc w:val="left"/>
+      <w:pPr>
+        <w:tabs>
+          <w:tab w:val="num" w:pos="4320"/>
+        </w:tabs>
+        <w:ind w:left="4320" w:hanging="360"/>
+      </w:pPr>
+      <w:rPr>
+        <w:rFonts w:ascii="Wingdings" w:hAnsi="Wingdings" w:hint="default"/>
+        <w:sz w:val="20"/>
+      </w:rPr>
+    </w:lvl>
+    <w:lvl w:ilvl="6" w:tentative="1">
+      <w:start w:val="1"/>
+      <w:numFmt w:val="bullet"/>
+      <w:lvlText w:val=""/>
+      <w:lvlJc w:val="left"/>
+      <w:pPr>
+        <w:tabs>
+          <w:tab w:val="num" w:pos="5040"/>
+        </w:tabs>
+        <w:ind w:left="5040" w:hanging="360"/>
+      </w:pPr>
+      <w:rPr>
+        <w:rFonts w:ascii="Wingdings" w:hAnsi="Wingdings" w:hint="default"/>
+        <w:sz w:val="20"/>
+      </w:rPr>
+    </w:lvl>
+    <w:lvl w:ilvl="7" w:tentative="1">
+      <w:start w:val="1"/>
+      <w:numFmt w:val="bullet"/>
+      <w:lvlText w:val=""/>
+      <w:lvlJc w:val="left"/>
+      <w:pPr>
+        <w:tabs>
+          <w:tab w:val="num" w:pos="5760"/>
+        </w:tabs>
+        <w:ind w:left="5760" w:hanging="360"/>
+      </w:pPr>
+      <w:rPr>
+        <w:rFonts w:ascii="Wingdings" w:hAnsi="Wingdings" w:hint="default"/>
+        <w:sz w:val="20"/>
+      </w:rPr>
+    </w:lvl>
+    <w:lvl w:ilvl="8" w:tentative="1">
+      <w:start w:val="1"/>
+      <w:numFmt w:val="bullet"/>
+      <w:lvlText w:val=""/>
+      <w:lvlJc w:val="left"/>
+      <w:pPr>
+        <w:tabs>
+          <w:tab w:val="num" w:pos="6480"/>
+        </w:tabs>
+        <w:ind w:left="6480" w:hanging="360"/>
+      </w:pPr>
+      <w:rPr>
+        <w:rFonts w:ascii="Wingdings" w:hAnsi="Wingdings" w:hint="default"/>
+        <w:sz w:val="20"/>
+      </w:rPr>
+    </w:lvl>
+  </w:abstractNum>
+  <w:abstractNum w:abstractNumId="1" w15:restartNumberingAfterBreak="0">
+    <w:nsid w:val="2D374B9B"/>
+    <w:multiLevelType w:val="multilevel"/>
+    <w:tmpl w:val="A13E4560"/>
+    <w:lvl w:ilvl="0">
+      <w:start w:val="1"/>
+      <w:numFmt w:val="bullet"/>
+      <w:lvlText w:val=""/>
+      <w:lvlJc w:val="left"/>
+      <w:pPr>
+        <w:tabs>
+          <w:tab w:val="num" w:pos="720"/>
+        </w:tabs>
+        <w:ind w:left="720" w:hanging="360"/>
+      </w:pPr>
+      <w:rPr>
+        <w:rFonts w:ascii="Symbol" w:hAnsi="Symbol" w:hint="default"/>
+        <w:sz w:val="20"/>
+      </w:rPr>
+    </w:lvl>
+    <w:lvl w:ilvl="1" w:tentative="1">
+      <w:start w:val="1"/>
+      <w:numFmt w:val="bullet"/>
+      <w:lvlText w:val="o"/>
+      <w:lvlJc w:val="left"/>
+      <w:pPr>
+        <w:tabs>
+          <w:tab w:val="num" w:pos="1440"/>
+        </w:tabs>
+        <w:ind w:left="1440" w:hanging="360"/>
+      </w:pPr>
+      <w:rPr>
+        <w:rFonts w:ascii="Courier New" w:hAnsi="Courier New" w:hint="default"/>
+        <w:sz w:val="20"/>
+      </w:rPr>
+    </w:lvl>
+    <w:lvl w:ilvl="2" w:tentative="1">
+      <w:start w:val="1"/>
+      <w:numFmt w:val="bullet"/>
+      <w:lvlText w:val=""/>
+      <w:lvlJc w:val="left"/>
+      <w:pPr>
+        <w:tabs>
+          <w:tab w:val="num" w:pos="2160"/>
+        </w:tabs>
+        <w:ind w:left="2160" w:hanging="360"/>
+      </w:pPr>
+      <w:rPr>
+        <w:rFonts w:ascii="Wingdings" w:hAnsi="Wingdings" w:hint="default"/>
+        <w:sz w:val="20"/>
+      </w:rPr>
+    </w:lvl>
+    <w:lvl w:ilvl="3" w:tentative="1">
+      <w:start w:val="1"/>
+      <w:numFmt w:val="bullet"/>
+      <w:lvlText w:val=""/>
+      <w:lvlJc w:val="left"/>
+      <w:pPr>
+        <w:tabs>
+          <w:tab w:val="num" w:pos="2880"/>
+        </w:tabs>
+        <w:ind w:left="2880" w:hanging="360"/>
+      </w:pPr>
+      <w:rPr>
+        <w:rFonts w:ascii="Wingdings" w:hAnsi="Wingdings" w:hint="default"/>
+        <w:sz w:val="20"/>
+      </w:rPr>
+    </w:lvl>
+    <w:lvl w:ilvl="4" w:tentative="1">
+      <w:start w:val="1"/>
+      <w:numFmt w:val="bullet"/>
+      <w:lvlText w:val=""/>
+      <w:lvlJc w:val="left"/>
+      <w:pPr>
+        <w:tabs>
+          <w:tab w:val="num" w:pos="3600"/>
+        </w:tabs>
+        <w:ind w:left="3600" w:hanging="360"/>
+      </w:pPr>
+      <w:rPr>
+        <w:rFonts w:ascii="Wingdings" w:hAnsi="Wingdings" w:hint="default"/>
+        <w:sz w:val="20"/>
+      </w:rPr>
+    </w:lvl>
+    <w:lvl w:ilvl="5" w:tentative="1">
+      <w:start w:val="1"/>
+      <w:numFmt w:val="bullet"/>
+      <w:lvlText w:val=""/>
+      <w:lvlJc w:val="left"/>
+      <w:pPr>
+        <w:tabs>
+          <w:tab w:val="num" w:pos="4320"/>
+        </w:tabs>
+        <w:ind w:left="4320" w:hanging="360"/>
+      </w:pPr>
+      <w:rPr>
+        <w:rFonts w:ascii="Wingdings" w:hAnsi="Wingdings" w:hint="default"/>
+        <w:sz w:val="20"/>
+      </w:rPr>
+    </w:lvl>
+    <w:lvl w:ilvl="6" w:tentative="1">
+      <w:start w:val="1"/>
+      <w:numFmt w:val="bullet"/>
+      <w:lvlText w:val=""/>
+      <w:lvlJc w:val="left"/>
+      <w:pPr>
+        <w:tabs>
+          <w:tab w:val="num" w:pos="5040"/>
+        </w:tabs>
+        <w:ind w:left="5040" w:hanging="360"/>
+      </w:pPr>
+      <w:rPr>
+        <w:rFonts w:ascii="Wingdings" w:hAnsi="Wingdings" w:hint="default"/>
+        <w:sz w:val="20"/>
+      </w:rPr>
+    </w:lvl>
+    <w:lvl w:ilvl="7" w:tentative="1">
+      <w:start w:val="1"/>
+      <w:numFmt w:val="bullet"/>
+      <w:lvlText w:val=""/>
+      <w:lvlJc w:val="left"/>
+      <w:pPr>
+        <w:tabs>
+          <w:tab w:val="num" w:pos="5760"/>
+        </w:tabs>
+        <w:ind w:left="5760" w:hanging="360"/>
+      </w:pPr>
+      <w:rPr>
+        <w:rFonts w:ascii="Wingdings" w:hAnsi="Wingdings" w:hint="default"/>
+        <w:sz w:val="20"/>
+      </w:rPr>
+    </w:lvl>
+    <w:lvl w:ilvl="8" w:tentative="1">
+      <w:start w:val="1"/>
+      <w:numFmt w:val="bullet"/>
+      <w:lvlText w:val=""/>
+      <w:lvlJc w:val="left"/>
+      <w:pPr>
+        <w:tabs>
+          <w:tab w:val="num" w:pos="6480"/>
+        </w:tabs>
+        <w:ind w:left="6480" w:hanging="360"/>
+      </w:pPr>
+      <w:rPr>
+        <w:rFonts w:ascii="Wingdings" w:hAnsi="Wingdings" w:hint="default"/>
+        <w:sz w:val="20"/>
+      </w:rPr>
+    </w:lvl>
+  </w:abstractNum>
+  <w:abstractNum w:abstractNumId="2" w15:restartNumberingAfterBreak="0">
+    <w:nsid w:val="3CC04F1B"/>
+    <w:multiLevelType w:val="multilevel"/>
+    <w:tmpl w:val="09D81B82"/>
+    <w:lvl w:ilvl="0">
+      <w:start w:val="1"/>
+      <w:numFmt w:val="bullet"/>
+      <w:lvlText w:val=""/>
+      <w:lvlJc w:val="left"/>
+      <w:pPr>
+        <w:tabs>
+          <w:tab w:val="num" w:pos="720"/>
+        </w:tabs>
+        <w:ind w:left="720" w:hanging="360"/>
+      </w:pPr>
+      <w:rPr>
+        <w:rFonts w:ascii="Symbol" w:hAnsi="Symbol" w:hint="default"/>
+        <w:sz w:val="20"/>
+      </w:rPr>
+    </w:lvl>
+    <w:lvl w:ilvl="1" w:tentative="1">
+      <w:start w:val="1"/>
+      <w:numFmt w:val="bullet"/>
+      <w:lvlText w:val="o"/>
+      <w:lvlJc w:val="left"/>
+      <w:pPr>
+        <w:tabs>
+          <w:tab w:val="num" w:pos="1440"/>
+        </w:tabs>
+        <w:ind w:left="1440" w:hanging="360"/>
+      </w:pPr>
+      <w:rPr>
+        <w:rFonts w:ascii="Courier New" w:hAnsi="Courier New" w:hint="default"/>
+        <w:sz w:val="20"/>
+      </w:rPr>
+    </w:lvl>
+    <w:lvl w:ilvl="2" w:tentative="1">
+      <w:start w:val="1"/>
+      <w:numFmt w:val="bullet"/>
+      <w:lvlText w:val=""/>
+      <w:lvlJc w:val="left"/>
+      <w:pPr>
+        <w:tabs>
+          <w:tab w:val="num" w:pos="2160"/>
+        </w:tabs>
+        <w:ind w:left="2160" w:hanging="360"/>
+      </w:pPr>
+      <w:rPr>
+        <w:rFonts w:ascii="Wingdings" w:hAnsi="Wingdings" w:hint="default"/>
+        <w:sz w:val="20"/>
+      </w:rPr>
+    </w:lvl>
+    <w:lvl w:ilvl="3" w:tentative="1">
+      <w:start w:val="1"/>
+      <w:numFmt w:val="bullet"/>
+      <w:lvlText w:val=""/>
+      <w:lvlJc w:val="left"/>
+      <w:pPr>
+        <w:tabs>
+          <w:tab w:val="num" w:pos="2880"/>
+        </w:tabs>
+        <w:ind w:left="2880" w:hanging="360"/>
+      </w:pPr>
+      <w:rPr>
+        <w:rFonts w:ascii="Wingdings" w:hAnsi="Wingdings" w:hint="default"/>
+        <w:sz w:val="20"/>
+      </w:rPr>
+    </w:lvl>
+    <w:lvl w:ilvl="4" w:tentative="1">
+      <w:start w:val="1"/>
+      <w:numFmt w:val="bullet"/>
+      <w:lvlText w:val=""/>
+      <w:lvlJc w:val="left"/>
+      <w:pPr>
+        <w:tabs>
+          <w:tab w:val="num" w:pos="3600"/>
+        </w:tabs>
+        <w:ind w:left="3600" w:hanging="360"/>
+      </w:pPr>
+      <w:rPr>
+        <w:rFonts w:ascii="Wingdings" w:hAnsi="Wingdings" w:hint="default"/>
+        <w:sz w:val="20"/>
+      </w:rPr>
+    </w:lvl>
+    <w:lvl w:ilvl="5" w:tentative="1">
+      <w:start w:val="1"/>
+      <w:numFmt w:val="bullet"/>
+      <w:lvlText w:val=""/>
+      <w:lvlJc w:val="left"/>
+      <w:pPr>
+        <w:tabs>
+          <w:tab w:val="num" w:pos="4320"/>
+        </w:tabs>
+        <w:ind w:left="4320" w:hanging="360"/>
+      </w:pPr>
+      <w:rPr>
+        <w:rFonts w:ascii="Wingdings" w:hAnsi="Wingdings" w:hint="default"/>
+        <w:sz w:val="20"/>
+      </w:rPr>
+    </w:lvl>
+    <w:lvl w:ilvl="6" w:tentative="1">
+      <w:start w:val="1"/>
+      <w:numFmt w:val="bullet"/>
+      <w:lvlText w:val=""/>
+      <w:lvlJc w:val="left"/>
+      <w:pPr>
+        <w:tabs>
+          <w:tab w:val="num" w:pos="5040"/>
+        </w:tabs>
+        <w:ind w:left="5040" w:hanging="360"/>
+      </w:pPr>
+      <w:rPr>
+        <w:rFonts w:ascii="Wingdings" w:hAnsi="Wingdings" w:hint="default"/>
+        <w:sz w:val="20"/>
+      </w:rPr>
+    </w:lvl>
+    <w:lvl w:ilvl="7" w:tentative="1">
+      <w:start w:val="1"/>
+      <w:numFmt w:val="bullet"/>
+      <w:lvlText w:val=""/>
+      <w:lvlJc w:val="left"/>
+      <w:pPr>
+        <w:tabs>
+          <w:tab w:val="num" w:pos="5760"/>
+        </w:tabs>
+        <w:ind w:left="5760" w:hanging="360"/>
+      </w:pPr>
+      <w:rPr>
+        <w:rFonts w:ascii="Wingdings" w:hAnsi="Wingdings" w:hint="default"/>
+        <w:sz w:val="20"/>
+      </w:rPr>
+    </w:lvl>
+    <w:lvl w:ilvl="8" w:tentative="1">
+      <w:start w:val="1"/>
+      <w:numFmt w:val="bullet"/>
+      <w:lvlText w:val=""/>
+      <w:lvlJc w:val="left"/>
+      <w:pPr>
+        <w:tabs>
+          <w:tab w:val="num" w:pos="6480"/>
+        </w:tabs>
+        <w:ind w:left="6480" w:hanging="360"/>
+      </w:pPr>
+      <w:rPr>
+        <w:rFonts w:ascii="Wingdings" w:hAnsi="Wingdings" w:hint="default"/>
+        <w:sz w:val="20"/>
+      </w:rPr>
+    </w:lvl>
+  </w:abstractNum>
+  <w:abstractNum w:abstractNumId="3" w15:restartNumberingAfterBreak="0">
+    <w:nsid w:val="6F3C3242"/>
+    <w:multiLevelType w:val="multilevel"/>
+    <w:tmpl w:val="A942BF32"/>
+    <w:lvl w:ilvl="0">
+      <w:start w:val="1"/>
+      <w:numFmt w:val="bullet"/>
+      <w:lvlText w:val=""/>
+      <w:lvlJc w:val="left"/>
+      <w:pPr>
+        <w:tabs>
+          <w:tab w:val="num" w:pos="720"/>
+        </w:tabs>
+        <w:ind w:left="720" w:hanging="360"/>
+      </w:pPr>
+      <w:rPr>
+        <w:rFonts w:ascii="Symbol" w:hAnsi="Symbol" w:hint="default"/>
+        <w:sz w:val="20"/>
+      </w:rPr>
+    </w:lvl>
+    <w:lvl w:ilvl="1" w:tentative="1">
+      <w:start w:val="1"/>
+      <w:numFmt w:val="bullet"/>
+      <w:lvlText w:val="o"/>
+      <w:lvlJc w:val="left"/>
+      <w:pPr>
+        <w:tabs>
+          <w:tab w:val="num" w:pos="1440"/>
+        </w:tabs>
+        <w:ind w:left="1440" w:hanging="360"/>
+      </w:pPr>
+      <w:rPr>
+        <w:rFonts w:ascii="Courier New" w:hAnsi="Courier New" w:hint="default"/>
+        <w:sz w:val="20"/>
+      </w:rPr>
+    </w:lvl>
+    <w:lvl w:ilvl="2" w:tentative="1">
+      <w:start w:val="1"/>
+      <w:numFmt w:val="bullet"/>
+      <w:lvlText w:val=""/>
+      <w:lvlJc w:val="left"/>
+      <w:pPr>
+        <w:tabs>
+          <w:tab w:val="num" w:pos="2160"/>
+        </w:tabs>
+        <w:ind w:left="2160" w:hanging="360"/>
+      </w:pPr>
+      <w:rPr>
+        <w:rFonts w:ascii="Wingdings" w:hAnsi="Wingdings" w:hint="default"/>
+        <w:sz w:val="20"/>
+      </w:rPr>
+    </w:lvl>
+    <w:lvl w:ilvl="3" w:tentative="1">
+      <w:start w:val="1"/>
+      <w:numFmt w:val="bullet"/>
+      <w:lvlText w:val=""/>
+      <w:lvlJc w:val="left"/>
+      <w:pPr>
+        <w:tabs>
+          <w:tab w:val="num" w:pos="2880"/>
+        </w:tabs>
+        <w:ind w:left="2880" w:hanging="360"/>
+      </w:pPr>
+      <w:rPr>
+        <w:rFonts w:ascii="Wingdings" w:hAnsi="Wingdings" w:hint="default"/>
+        <w:sz w:val="20"/>
+      </w:rPr>
+    </w:lvl>
+    <w:lvl w:ilvl="4" w:tentative="1">
+      <w:start w:val="1"/>
+      <w:numFmt w:val="bullet"/>
+      <w:lvlText w:val=""/>
+      <w:lvlJc w:val="left"/>
+      <w:pPr>
+        <w:tabs>
+          <w:tab w:val="num" w:pos="3600"/>
+        </w:tabs>
+        <w:ind w:left="3600" w:hanging="360"/>
+      </w:pPr>
+      <w:rPr>
+        <w:rFonts w:ascii="Wingdings" w:hAnsi="Wingdings" w:hint="default"/>
+        <w:sz w:val="20"/>
+      </w:rPr>
+    </w:lvl>
+    <w:lvl w:ilvl="5" w:tentative="1">
+      <w:start w:val="1"/>
+      <w:numFmt w:val="bullet"/>
+      <w:lvlText w:val=""/>
+      <w:lvlJc w:val="left"/>
+      <w:pPr>
+        <w:tabs>
+          <w:tab w:val="num" w:pos="4320"/>
+        </w:tabs>
+        <w:ind w:left="4320" w:hanging="360"/>
+      </w:pPr>
+      <w:rPr>
+        <w:rFonts w:ascii="Wingdings" w:hAnsi="Wingdings" w:hint="default"/>
+        <w:sz w:val="20"/>
+      </w:rPr>
+    </w:lvl>
+    <w:lvl w:ilvl="6" w:tentative="1">
+      <w:start w:val="1"/>
+      <w:numFmt w:val="bullet"/>
+      <w:lvlText w:val=""/>
+      <w:lvlJc w:val="left"/>
+      <w:pPr>
+        <w:tabs>
+          <w:tab w:val="num" w:pos="5040"/>
+        </w:tabs>
+        <w:ind w:left="5040" w:hanging="360"/>
+      </w:pPr>
+      <w:rPr>
+        <w:rFonts w:ascii="Wingdings" w:hAnsi="Wingdings" w:hint="default"/>
+        <w:sz w:val="20"/>
+      </w:rPr>
+    </w:lvl>
+    <w:lvl w:ilvl="7" w:tentative="1">
+      <w:start w:val="1"/>
+      <w:numFmt w:val="bullet"/>
+      <w:lvlText w:val=""/>
+      <w:lvlJc w:val="left"/>
+      <w:pPr>
+        <w:tabs>
+          <w:tab w:val="num" w:pos="5760"/>
+        </w:tabs>
+        <w:ind w:left="5760" w:hanging="360"/>
+      </w:pPr>
+      <w:rPr>
+        <w:rFonts w:ascii="Wingdings" w:hAnsi="Wingdings" w:hint="default"/>
+        <w:sz w:val="20"/>
+      </w:rPr>
+    </w:lvl>
+    <w:lvl w:ilvl="8" w:tentative="1">
+      <w:start w:val="1"/>
+      <w:numFmt w:val="bullet"/>
+      <w:lvlText w:val=""/>
+      <w:lvlJc w:val="left"/>
+      <w:pPr>
+        <w:tabs>
+          <w:tab w:val="num" w:pos="6480"/>
+        </w:tabs>
+        <w:ind w:left="6480" w:hanging="360"/>
+      </w:pPr>
+      <w:rPr>
+        <w:rFonts w:ascii="Wingdings" w:hAnsi="Wingdings" w:hint="default"/>
+        <w:sz w:val="20"/>
+      </w:rPr>
+    </w:lvl>
+  </w:abstractNum>
+  <w:num w:numId="1" w16cid:durableId="1070813761">
+    <w:abstractNumId w:val="3"/>
+  </w:num>
+  <w:num w:numId="2" w16cid:durableId="1563716008">
+    <w:abstractNumId w:val="2"/>
+  </w:num>
+  <w:num w:numId="3" w16cid:durableId="1631131730">
+    <w:abstractNumId w:val="1"/>
+  </w:num>
+  <w:num w:numId="4" w16cid:durableId="1287782999">
+    <w:abstractNumId w:val="0"/>
+  </w:num>
+</w:numbering>
 </file>
 
 <file path=word/styles.xml><?xml version="1.0" encoding="utf-8"?>

</xml_diff>